<commit_message>
Refactor notifications for clean non-bulky formatting & add Emergency Accident/Hospital Alert safeguard
</commit_message>
<xml_diff>
--- a/WHIS_AI_PROJECT_REPORT.docx
+++ b/WHIS_AI_PROJECT_REPORT.docx
@@ -11,7 +11,7 @@
           <w:rFonts w:ascii="Arial" w:hAnsi="Arial"/>
           <w:b/>
           <w:color w:val="123456"/>
-          <w:sz w:val="40"/>
+          <w:sz w:val="36"/>
         </w:rPr>
         <w:t>WHIS AI — COMPREHENSIVE CYBER DEFENSE PROJECT REPORT</w:t>
       </w:r>
@@ -27,7 +27,7 @@
           <w:color w:val="646464"/>
           <w:sz w:val="22"/>
         </w:rPr>
-        <w:t>Hybrid Multi-Provider AI Cyber Security Platform for India | Android 7.0 to 16</w:t>
+        <w:t>Whis AI — Cyber Security &amp; Scam Defense Platform | Android 7.0 to 16</w:t>
       </w:r>
     </w:p>
     <w:p/>

</xml_diff>